<commit_message>
Align CV and study plan with the applicant's final motivation letter
The applicant rewrote the motivation letter and settled several facts, so
both other documents now follow it: address and place of signature in
Geisingen, the office at the sports club as second board member, the club
name spelled as one word, and the date of 22 September.

Also removes the duplication the letter created. It now carries the
management-master argument and the one-year density argument, so the study
plan keeps only what is its own, the German alternatives, and states the
career aim in the same words the letter uses.

Co-Authored-By: Claude Opus 5 <noreply@anthropic.com>
Claude-Session: https://claude.ai/code/session_018EEFYAf6pBJaMga5G9Xzjo
</commit_message>
<xml_diff>
--- a/DAAD_Bewerbung/04_Dokumente/Lebenslauf_Tim_Roesch_DAAD.docx
+++ b/DAAD_Bewerbung/04_Dokumente/Lebenslauf_Tim_Roesch_DAAD.docx
@@ -69,7 +69,7 @@
                 <w:sz w:val="19"/>
                 <w:szCs w:val="19"/>
               </w:rPr>
-              <w:t xml:space="preserve">Stuttgart, Deutschland</w:t>
+              <w:t xml:space="preserve">Margeritenweg 3, 78187 Geisingen</w:t>
             </w:r>
           </w:p>
           <w:p>
@@ -1764,7 +1764,7 @@
                 <w:sz w:val="21"/>
                 <w:szCs w:val="21"/>
               </w:rPr>
-              <w:t xml:space="preserve">Vorstand, Sport Gemeinschaft Kirchen-Hausen e. V.</w:t>
+              <w:t xml:space="preserve">Zweiter Vorstand, Sportgemeinschaft Kirchen-Hausen e. V.</w:t>
             </w:r>
           </w:p>
           <w:p>
@@ -2128,19 +2128,7 @@
                 <w:sz w:val="22"/>
                 <w:szCs w:val="22"/>
               </w:rPr>
-              <w:t xml:space="preserve">Verhandlungssicher; </w:t>
-            </w:r>
-            <w:r>
-              <w:rPr>
-                <w:rFonts w:ascii="Calibri" w:cs="Calibri" w:eastAsia="Calibri" w:hAnsi="Calibri"/>
-                <w:b w:val="false"/>
-                <w:bCs w:val="false"/>
-                <w:sz w:val="22"/>
-                <w:szCs w:val="22"/>
-                <w:highlight w:val="yellow"/>
-                <w:highlightCs w:val="yellow"/>
-              </w:rPr>
-              <w:t xml:space="preserve">[Zertifikat und Jahr]</w:t>
+              <w:t xml:space="preserve">Verhandlungssicher; rund die Hälfte des Bachelorstudiums sowie drei Monate Projektarbeit in Singapur auf Englisch</w:t>
             </w:r>
           </w:p>
         </w:tc>
@@ -2501,19 +2489,7 @@
           <w:sz w:val="22"/>
           <w:szCs w:val="22"/>
         </w:rPr>
-        <w:t xml:space="preserve">Stuttgart, </w:t>
-      </w:r>
-      <w:r>
-        <w:rPr>
-          <w:rFonts w:ascii="Calibri" w:cs="Calibri" w:eastAsia="Calibri" w:hAnsi="Calibri"/>
-          <w:b w:val="false"/>
-          <w:bCs w:val="false"/>
-          <w:sz w:val="22"/>
-          <w:szCs w:val="22"/>
-          <w:highlight w:val="yellow"/>
-          <w:highlightCs w:val="yellow"/>
-        </w:rPr>
-        <w:t xml:space="preserve">[Datum]</w:t>
+        <w:t xml:space="preserve">Geisingen, 22.09.2026</w:t>
       </w:r>
     </w:p>
     <w:sectPr>

</xml_diff>